<commit_message>
Polish FYP reports, PPT, and viva pack for demo clarity.
Simplify architecture wording, pin Demo B FX at 20, speed CSV imports, and document frameworks, FxRateCache, and presenter notes.

Co-authored-by: Cursor <cursoragent@cursor.com>
</commit_message>
<xml_diff>
--- a/docs/report/Tranz-Algo_Final_Year_Project_Report_2026_Musonda_Katongo.docx
+++ b/docs/report/Tranz-Algo_Final_Year_Project_Report_2026_Musonda_Katongo.docx
@@ -315,7 +315,7 @@
           <w:color w:val="000000"/>
           <w:sz w:val="24"/>
         </w:rPr>
-        <w:t>Supervisor: [SUPERVISOR NAME]</w:t>
+        <w:t>Supervisor: Mrs. Leena Kumar</w:t>
       </w:r>
     </w:p>
     <w:p>
@@ -509,7 +509,7 @@
           <w:color w:val="000000"/>
           <w:sz w:val="24"/>
         </w:rPr>
-        <w:t>Supervisor Name: [SUPERVISOR NAME]</w:t>
+        <w:t>Supervisor Name: Mrs. Leena Kumar</w:t>
       </w:r>
     </w:p>
     <w:p>
@@ -671,7 +671,7 @@
           <w:color w:val="000000"/>
           <w:sz w:val="24"/>
         </w:rPr>
-        <w:t>I thank my supervisor, [SUPERVISOR NAME], for guidance throughout this final year project. I also thank the Department of Computing and Informatics, University of Zambia, for providing the academic framework and assessment standards that shaped this work. Finally, I acknowledge Nixon Shibuchi for joint design discussions and complementary implementation effort that produced the working Tranz-Algo MVP.</w:t>
+        <w:t>I thank my supervisor, Mrs. Leena Kumar, for guidance throughout this final year project. I also thank the Department of Computing and Informatics, University of Zambia, for providing the academic framework and assessment standards that shaped this work. Finally, I acknowledge Nixon Shibuchi for joint design discussions and complementary implementation effort that produced the working Tranz-Algo MVP.</w:t>
       </w:r>
     </w:p>
     <w:p>
@@ -708,6 +708,1371 @@
           <w:sz w:val="24"/>
         </w:rPr>
         <w:t>This is an individual report for a two-member group project. The shared system is Tranz-Algo. The co-author is Nixon Shibuchi. Each student submits only their own individual report (not a joint Word document). The shared source code and documentation live in the project Git repository: https://github.com/Nixon-Shibuchi/Tranz-Algo. Individual responsibilities for Musonda Katongo are stated in Chapter 5 and Appendix A. Each student remains responsible for understanding the full system and for the honesty of their contribution claims.</w:t>
+      </w:r>
+    </w:p>
+    <w:p>
+      <w:r>
+        <w:br w:type="page"/>
+      </w:r>
+    </w:p>
+    <w:p>
+      <w:pPr>
+        <w:pStyle w:val="Heading1"/>
+        <w:spacing w:before="280" w:after="160"/>
+      </w:pPr>
+      <w:r>
+        <w:rPr>
+          <w:rFonts w:ascii="Times New Roman" w:hAnsi="Times New Roman" w:eastAsia="Times New Roman"/>
+          <w:b/>
+          <w:i w:val="0"/>
+          <w:color w:val="000000"/>
+          <w:sz w:val="32"/>
+        </w:rPr>
+        <w:t>TABLE OF CONTENTS</w:t>
+      </w:r>
+    </w:p>
+    <w:p>
+      <w:pPr>
+        <w:spacing w:after="80" w:before="40" w:line="360" w:lineRule="auto"/>
+        <w:ind w:firstLine="0" w:left="0"/>
+      </w:pPr>
+      <w:r>
+        <w:rPr>
+          <w:rFonts w:ascii="Times New Roman" w:hAnsi="Times New Roman" w:eastAsia="Times New Roman"/>
+          <w:b/>
+          <w:i w:val="0"/>
+          <w:color w:val="000000"/>
+          <w:sz w:val="24"/>
+        </w:rPr>
+        <w:t>DECLARATION</w:t>
+      </w:r>
+    </w:p>
+    <w:p>
+      <w:pPr>
+        <w:spacing w:after="80" w:before="40" w:line="360" w:lineRule="auto"/>
+        <w:ind w:firstLine="0" w:left="0"/>
+      </w:pPr>
+      <w:r>
+        <w:rPr>
+          <w:rFonts w:ascii="Times New Roman" w:hAnsi="Times New Roman" w:eastAsia="Times New Roman"/>
+          <w:b/>
+          <w:i w:val="0"/>
+          <w:color w:val="000000"/>
+          <w:sz w:val="24"/>
+        </w:rPr>
+        <w:t>APPROVAL</w:t>
+      </w:r>
+    </w:p>
+    <w:p>
+      <w:pPr>
+        <w:spacing w:after="80" w:before="40" w:line="360" w:lineRule="auto"/>
+        <w:ind w:firstLine="0" w:left="0"/>
+      </w:pPr>
+      <w:r>
+        <w:rPr>
+          <w:rFonts w:ascii="Times New Roman" w:hAnsi="Times New Roman" w:eastAsia="Times New Roman"/>
+          <w:b/>
+          <w:i w:val="0"/>
+          <w:color w:val="000000"/>
+          <w:sz w:val="24"/>
+        </w:rPr>
+        <w:t>ABSTRACT</w:t>
+      </w:r>
+    </w:p>
+    <w:p>
+      <w:pPr>
+        <w:spacing w:after="80" w:before="40" w:line="360" w:lineRule="auto"/>
+        <w:ind w:firstLine="0" w:left="0"/>
+      </w:pPr>
+      <w:r>
+        <w:rPr>
+          <w:rFonts w:ascii="Times New Roman" w:hAnsi="Times New Roman" w:eastAsia="Times New Roman"/>
+          <w:b/>
+          <w:i w:val="0"/>
+          <w:color w:val="000000"/>
+          <w:sz w:val="24"/>
+        </w:rPr>
+        <w:t>ACKNOWLEDGEMENTS</w:t>
+      </w:r>
+    </w:p>
+    <w:p>
+      <w:pPr>
+        <w:spacing w:after="80" w:before="40" w:line="360" w:lineRule="auto"/>
+        <w:ind w:firstLine="0" w:left="0"/>
+      </w:pPr>
+      <w:r>
+        <w:rPr>
+          <w:rFonts w:ascii="Times New Roman" w:hAnsi="Times New Roman" w:eastAsia="Times New Roman"/>
+          <w:b/>
+          <w:i w:val="0"/>
+          <w:color w:val="000000"/>
+          <w:sz w:val="24"/>
+        </w:rPr>
+        <w:t>NOTE ON GROUP PROJECTS</w:t>
+      </w:r>
+    </w:p>
+    <w:p>
+      <w:pPr>
+        <w:spacing w:after="80" w:before="40" w:line="360" w:lineRule="auto"/>
+        <w:ind w:firstLine="0" w:left="0"/>
+      </w:pPr>
+      <w:r>
+        <w:rPr>
+          <w:rFonts w:ascii="Times New Roman" w:hAnsi="Times New Roman" w:eastAsia="Times New Roman"/>
+          <w:b/>
+          <w:i w:val="0"/>
+          <w:color w:val="000000"/>
+          <w:sz w:val="24"/>
+        </w:rPr>
+        <w:t>LIST OF ABBREVIATIONS AND ACRONYMS</w:t>
+      </w:r>
+    </w:p>
+    <w:p>
+      <w:pPr>
+        <w:spacing w:after="80" w:before="40" w:line="360" w:lineRule="auto"/>
+        <w:ind w:firstLine="0" w:left="0"/>
+      </w:pPr>
+      <w:r>
+        <w:rPr>
+          <w:rFonts w:ascii="Times New Roman" w:hAnsi="Times New Roman" w:eastAsia="Times New Roman"/>
+          <w:b/>
+          <w:i w:val="0"/>
+          <w:color w:val="000000"/>
+          <w:sz w:val="24"/>
+        </w:rPr>
+        <w:t>Chapter 1  Introduction</w:t>
+      </w:r>
+    </w:p>
+    <w:p>
+      <w:pPr>
+        <w:spacing w:after="80" w:before="0" w:line="360" w:lineRule="auto"/>
+        <w:ind w:firstLine="0" w:left="283"/>
+      </w:pPr>
+      <w:r>
+        <w:rPr>
+          <w:rFonts w:ascii="Times New Roman" w:hAnsi="Times New Roman" w:eastAsia="Times New Roman"/>
+          <w:b w:val="0"/>
+          <w:i w:val="0"/>
+          <w:color w:val="000000"/>
+          <w:sz w:val="24"/>
+        </w:rPr>
+        <w:t>1.1 Background and Context</w:t>
+      </w:r>
+    </w:p>
+    <w:p>
+      <w:pPr>
+        <w:spacing w:after="80" w:before="0" w:line="360" w:lineRule="auto"/>
+        <w:ind w:firstLine="0" w:left="283"/>
+      </w:pPr>
+      <w:r>
+        <w:rPr>
+          <w:rFonts w:ascii="Times New Roman" w:hAnsi="Times New Roman" w:eastAsia="Times New Roman"/>
+          <w:b w:val="0"/>
+          <w:i w:val="0"/>
+          <w:color w:val="000000"/>
+          <w:sz w:val="24"/>
+        </w:rPr>
+        <w:t>1.2 Problem Statement</w:t>
+      </w:r>
+    </w:p>
+    <w:p>
+      <w:pPr>
+        <w:spacing w:after="80" w:before="0" w:line="360" w:lineRule="auto"/>
+        <w:ind w:firstLine="0" w:left="283"/>
+      </w:pPr>
+      <w:r>
+        <w:rPr>
+          <w:rFonts w:ascii="Times New Roman" w:hAnsi="Times New Roman" w:eastAsia="Times New Roman"/>
+          <w:b w:val="0"/>
+          <w:i w:val="0"/>
+          <w:color w:val="000000"/>
+          <w:sz w:val="24"/>
+        </w:rPr>
+        <w:t>1.3 Project Aim</w:t>
+      </w:r>
+    </w:p>
+    <w:p>
+      <w:pPr>
+        <w:spacing w:after="80" w:before="0" w:line="360" w:lineRule="auto"/>
+        <w:ind w:firstLine="0" w:left="283"/>
+      </w:pPr>
+      <w:r>
+        <w:rPr>
+          <w:rFonts w:ascii="Times New Roman" w:hAnsi="Times New Roman" w:eastAsia="Times New Roman"/>
+          <w:b w:val="0"/>
+          <w:i w:val="0"/>
+          <w:color w:val="000000"/>
+          <w:sz w:val="24"/>
+        </w:rPr>
+        <w:t>1.4 Project Objectives</w:t>
+      </w:r>
+    </w:p>
+    <w:p>
+      <w:pPr>
+        <w:spacing w:after="80" w:before="0" w:line="360" w:lineRule="auto"/>
+        <w:ind w:firstLine="0" w:left="283"/>
+      </w:pPr>
+      <w:r>
+        <w:rPr>
+          <w:rFonts w:ascii="Times New Roman" w:hAnsi="Times New Roman" w:eastAsia="Times New Roman"/>
+          <w:b w:val="0"/>
+          <w:i w:val="0"/>
+          <w:color w:val="000000"/>
+          <w:sz w:val="24"/>
+        </w:rPr>
+        <w:t>1.5 Research Questions</w:t>
+      </w:r>
+    </w:p>
+    <w:p>
+      <w:pPr>
+        <w:spacing w:after="80" w:before="0" w:line="360" w:lineRule="auto"/>
+        <w:ind w:firstLine="0" w:left="283"/>
+      </w:pPr>
+      <w:r>
+        <w:rPr>
+          <w:rFonts w:ascii="Times New Roman" w:hAnsi="Times New Roman" w:eastAsia="Times New Roman"/>
+          <w:b w:val="0"/>
+          <w:i w:val="0"/>
+          <w:color w:val="000000"/>
+          <w:sz w:val="24"/>
+        </w:rPr>
+        <w:t>1.6 Scope of the Project</w:t>
+      </w:r>
+    </w:p>
+    <w:p>
+      <w:pPr>
+        <w:spacing w:after="80" w:before="0" w:line="360" w:lineRule="auto"/>
+        <w:ind w:firstLine="0" w:left="283"/>
+      </w:pPr>
+      <w:r>
+        <w:rPr>
+          <w:rFonts w:ascii="Times New Roman" w:hAnsi="Times New Roman" w:eastAsia="Times New Roman"/>
+          <w:b w:val="0"/>
+          <w:i w:val="0"/>
+          <w:color w:val="000000"/>
+          <w:sz w:val="24"/>
+        </w:rPr>
+        <w:t>1.7 Significance of the Project</w:t>
+      </w:r>
+    </w:p>
+    <w:p>
+      <w:pPr>
+        <w:spacing w:after="80" w:before="0" w:line="360" w:lineRule="auto"/>
+        <w:ind w:firstLine="0" w:left="283"/>
+      </w:pPr>
+      <w:r>
+        <w:rPr>
+          <w:rFonts w:ascii="Times New Roman" w:hAnsi="Times New Roman" w:eastAsia="Times New Roman"/>
+          <w:b w:val="0"/>
+          <w:i w:val="0"/>
+          <w:color w:val="000000"/>
+          <w:sz w:val="24"/>
+        </w:rPr>
+        <w:t>1.8 Limitations</w:t>
+      </w:r>
+    </w:p>
+    <w:p>
+      <w:pPr>
+        <w:spacing w:after="80" w:before="0" w:line="360" w:lineRule="auto"/>
+        <w:ind w:firstLine="0" w:left="283"/>
+      </w:pPr>
+      <w:r>
+        <w:rPr>
+          <w:rFonts w:ascii="Times New Roman" w:hAnsi="Times New Roman" w:eastAsia="Times New Roman"/>
+          <w:b w:val="0"/>
+          <w:i w:val="0"/>
+          <w:color w:val="000000"/>
+          <w:sz w:val="24"/>
+        </w:rPr>
+        <w:t>1.9 Organisation of the Report</w:t>
+      </w:r>
+    </w:p>
+    <w:p>
+      <w:pPr>
+        <w:spacing w:after="80" w:before="40" w:line="360" w:lineRule="auto"/>
+        <w:ind w:firstLine="0" w:left="0"/>
+      </w:pPr>
+      <w:r>
+        <w:rPr>
+          <w:rFonts w:ascii="Times New Roman" w:hAnsi="Times New Roman" w:eastAsia="Times New Roman"/>
+          <w:b/>
+          <w:i w:val="0"/>
+          <w:color w:val="000000"/>
+          <w:sz w:val="24"/>
+        </w:rPr>
+        <w:t>Chapter 2  Literature Review</w:t>
+      </w:r>
+    </w:p>
+    <w:p>
+      <w:pPr>
+        <w:spacing w:after="80" w:before="0" w:line="360" w:lineRule="auto"/>
+        <w:ind w:firstLine="0" w:left="283"/>
+      </w:pPr>
+      <w:r>
+        <w:rPr>
+          <w:rFonts w:ascii="Times New Roman" w:hAnsi="Times New Roman" w:eastAsia="Times New Roman"/>
+          <w:b w:val="0"/>
+          <w:i w:val="0"/>
+          <w:color w:val="000000"/>
+          <w:sz w:val="24"/>
+        </w:rPr>
+        <w:t>2.1 Introduction</w:t>
+      </w:r>
+    </w:p>
+    <w:p>
+      <w:pPr>
+        <w:spacing w:after="80" w:before="0" w:line="360" w:lineRule="auto"/>
+        <w:ind w:firstLine="0" w:left="283"/>
+      </w:pPr>
+      <w:r>
+        <w:rPr>
+          <w:rFonts w:ascii="Times New Roman" w:hAnsi="Times New Roman" w:eastAsia="Times New Roman"/>
+          <w:b w:val="0"/>
+          <w:i w:val="0"/>
+          <w:color w:val="000000"/>
+          <w:sz w:val="24"/>
+        </w:rPr>
+        <w:t>2.2 Key Concepts and Theories</w:t>
+      </w:r>
+    </w:p>
+    <w:p>
+      <w:pPr>
+        <w:spacing w:after="80" w:before="0" w:line="360" w:lineRule="auto"/>
+        <w:ind w:firstLine="0" w:left="283"/>
+      </w:pPr>
+      <w:r>
+        <w:rPr>
+          <w:rFonts w:ascii="Times New Roman" w:hAnsi="Times New Roman" w:eastAsia="Times New Roman"/>
+          <w:b w:val="0"/>
+          <w:i w:val="0"/>
+          <w:color w:val="000000"/>
+          <w:sz w:val="24"/>
+        </w:rPr>
+        <w:t>2.3 Existing Systems / Related Work</w:t>
+      </w:r>
+    </w:p>
+    <w:p>
+      <w:pPr>
+        <w:spacing w:after="80" w:before="0" w:line="360" w:lineRule="auto"/>
+        <w:ind w:firstLine="0" w:left="283"/>
+      </w:pPr>
+      <w:r>
+        <w:rPr>
+          <w:rFonts w:ascii="Times New Roman" w:hAnsi="Times New Roman" w:eastAsia="Times New Roman"/>
+          <w:b w:val="0"/>
+          <w:i w:val="0"/>
+          <w:color w:val="000000"/>
+          <w:sz w:val="24"/>
+        </w:rPr>
+        <w:t>2.4 Comparative Analysis</w:t>
+      </w:r>
+    </w:p>
+    <w:p>
+      <w:pPr>
+        <w:spacing w:after="80" w:before="0" w:line="360" w:lineRule="auto"/>
+        <w:ind w:firstLine="0" w:left="283"/>
+      </w:pPr>
+      <w:r>
+        <w:rPr>
+          <w:rFonts w:ascii="Times New Roman" w:hAnsi="Times New Roman" w:eastAsia="Times New Roman"/>
+          <w:b w:val="0"/>
+          <w:i w:val="0"/>
+          <w:color w:val="000000"/>
+          <w:sz w:val="24"/>
+        </w:rPr>
+        <w:t>2.5 Research / Knowledge Gap</w:t>
+      </w:r>
+    </w:p>
+    <w:p>
+      <w:pPr>
+        <w:spacing w:after="80" w:before="0" w:line="360" w:lineRule="auto"/>
+        <w:ind w:firstLine="0" w:left="283"/>
+      </w:pPr>
+      <w:r>
+        <w:rPr>
+          <w:rFonts w:ascii="Times New Roman" w:hAnsi="Times New Roman" w:eastAsia="Times New Roman"/>
+          <w:b w:val="0"/>
+          <w:i w:val="0"/>
+          <w:color w:val="000000"/>
+          <w:sz w:val="24"/>
+        </w:rPr>
+        <w:t>2.6 Conceptual Framework</w:t>
+      </w:r>
+    </w:p>
+    <w:p>
+      <w:pPr>
+        <w:spacing w:after="80" w:before="0" w:line="360" w:lineRule="auto"/>
+        <w:ind w:firstLine="0" w:left="283"/>
+      </w:pPr>
+      <w:r>
+        <w:rPr>
+          <w:rFonts w:ascii="Times New Roman" w:hAnsi="Times New Roman" w:eastAsia="Times New Roman"/>
+          <w:b w:val="0"/>
+          <w:i w:val="0"/>
+          <w:color w:val="000000"/>
+          <w:sz w:val="24"/>
+        </w:rPr>
+        <w:t>2.7 Chapter Summary</w:t>
+      </w:r>
+    </w:p>
+    <w:p>
+      <w:pPr>
+        <w:spacing w:after="80" w:before="40" w:line="360" w:lineRule="auto"/>
+        <w:ind w:firstLine="0" w:left="0"/>
+      </w:pPr>
+      <w:r>
+        <w:rPr>
+          <w:rFonts w:ascii="Times New Roman" w:hAnsi="Times New Roman" w:eastAsia="Times New Roman"/>
+          <w:b/>
+          <w:i w:val="0"/>
+          <w:color w:val="000000"/>
+          <w:sz w:val="24"/>
+        </w:rPr>
+        <w:t>Chapter 3  Methodology</w:t>
+      </w:r>
+    </w:p>
+    <w:p>
+      <w:pPr>
+        <w:spacing w:after="80" w:before="0" w:line="360" w:lineRule="auto"/>
+        <w:ind w:firstLine="0" w:left="283"/>
+      </w:pPr>
+      <w:r>
+        <w:rPr>
+          <w:rFonts w:ascii="Times New Roman" w:hAnsi="Times New Roman" w:eastAsia="Times New Roman"/>
+          <w:b w:val="0"/>
+          <w:i w:val="0"/>
+          <w:color w:val="000000"/>
+          <w:sz w:val="24"/>
+        </w:rPr>
+        <w:t>3.1 Introduction</w:t>
+      </w:r>
+    </w:p>
+    <w:p>
+      <w:pPr>
+        <w:spacing w:after="80" w:before="0" w:line="360" w:lineRule="auto"/>
+        <w:ind w:firstLine="0" w:left="283"/>
+      </w:pPr>
+      <w:r>
+        <w:rPr>
+          <w:rFonts w:ascii="Times New Roman" w:hAnsi="Times New Roman" w:eastAsia="Times New Roman"/>
+          <w:b w:val="0"/>
+          <w:i w:val="0"/>
+          <w:color w:val="000000"/>
+          <w:sz w:val="24"/>
+        </w:rPr>
+        <w:t>3.2 Research / Development Approach</w:t>
+      </w:r>
+    </w:p>
+    <w:p>
+      <w:pPr>
+        <w:spacing w:after="80" w:before="0" w:line="360" w:lineRule="auto"/>
+        <w:ind w:firstLine="0" w:left="283"/>
+      </w:pPr>
+      <w:r>
+        <w:rPr>
+          <w:rFonts w:ascii="Times New Roman" w:hAnsi="Times New Roman" w:eastAsia="Times New Roman"/>
+          <w:b w:val="0"/>
+          <w:i w:val="0"/>
+          <w:color w:val="000000"/>
+          <w:sz w:val="24"/>
+        </w:rPr>
+        <w:t>3.3 Requirements / Data Collection</w:t>
+      </w:r>
+    </w:p>
+    <w:p>
+      <w:pPr>
+        <w:spacing w:after="80" w:before="0" w:line="360" w:lineRule="auto"/>
+        <w:ind w:firstLine="0" w:left="283"/>
+      </w:pPr>
+      <w:r>
+        <w:rPr>
+          <w:rFonts w:ascii="Times New Roman" w:hAnsi="Times New Roman" w:eastAsia="Times New Roman"/>
+          <w:b w:val="0"/>
+          <w:i w:val="0"/>
+          <w:color w:val="000000"/>
+          <w:sz w:val="24"/>
+        </w:rPr>
+        <w:t>3.4 System Architecture / Research Workflow</w:t>
+      </w:r>
+    </w:p>
+    <w:p>
+      <w:pPr>
+        <w:spacing w:after="80" w:before="0" w:line="360" w:lineRule="auto"/>
+        <w:ind w:firstLine="0" w:left="283"/>
+      </w:pPr>
+      <w:r>
+        <w:rPr>
+          <w:rFonts w:ascii="Times New Roman" w:hAnsi="Times New Roman" w:eastAsia="Times New Roman"/>
+          <w:b w:val="0"/>
+          <w:i w:val="0"/>
+          <w:color w:val="000000"/>
+          <w:sz w:val="24"/>
+        </w:rPr>
+        <w:t>3.5 Tools and Technologies</w:t>
+      </w:r>
+    </w:p>
+    <w:p>
+      <w:pPr>
+        <w:spacing w:after="80" w:before="0" w:line="360" w:lineRule="auto"/>
+        <w:ind w:firstLine="0" w:left="283"/>
+      </w:pPr>
+      <w:r>
+        <w:rPr>
+          <w:rFonts w:ascii="Times New Roman" w:hAnsi="Times New Roman" w:eastAsia="Times New Roman"/>
+          <w:b w:val="0"/>
+          <w:i w:val="0"/>
+          <w:color w:val="000000"/>
+          <w:sz w:val="24"/>
+        </w:rPr>
+        <w:t>3.6 Ethical and Legal Considerations</w:t>
+      </w:r>
+    </w:p>
+    <w:p>
+      <w:pPr>
+        <w:spacing w:after="80" w:before="0" w:line="360" w:lineRule="auto"/>
+        <w:ind w:firstLine="0" w:left="283"/>
+      </w:pPr>
+      <w:r>
+        <w:rPr>
+          <w:rFonts w:ascii="Times New Roman" w:hAnsi="Times New Roman" w:eastAsia="Times New Roman"/>
+          <w:b w:val="0"/>
+          <w:i w:val="0"/>
+          <w:color w:val="000000"/>
+          <w:sz w:val="24"/>
+        </w:rPr>
+        <w:t>3.7 Evaluation Method</w:t>
+      </w:r>
+    </w:p>
+    <w:p>
+      <w:pPr>
+        <w:spacing w:after="80" w:before="0" w:line="360" w:lineRule="auto"/>
+        <w:ind w:firstLine="0" w:left="283"/>
+      </w:pPr>
+      <w:r>
+        <w:rPr>
+          <w:rFonts w:ascii="Times New Roman" w:hAnsi="Times New Roman" w:eastAsia="Times New Roman"/>
+          <w:b w:val="0"/>
+          <w:i w:val="0"/>
+          <w:color w:val="000000"/>
+          <w:sz w:val="24"/>
+        </w:rPr>
+        <w:t>3.8 Chapter Summary</w:t>
+      </w:r>
+    </w:p>
+    <w:p>
+      <w:pPr>
+        <w:spacing w:after="80" w:before="40" w:line="360" w:lineRule="auto"/>
+        <w:ind w:firstLine="0" w:left="0"/>
+      </w:pPr>
+      <w:r>
+        <w:rPr>
+          <w:rFonts w:ascii="Times New Roman" w:hAnsi="Times New Roman" w:eastAsia="Times New Roman"/>
+          <w:b/>
+          <w:i w:val="0"/>
+          <w:color w:val="000000"/>
+          <w:sz w:val="24"/>
+        </w:rPr>
+        <w:t>Chapter 4  System Analysis and Design</w:t>
+      </w:r>
+    </w:p>
+    <w:p>
+      <w:pPr>
+        <w:spacing w:after="80" w:before="0" w:line="360" w:lineRule="auto"/>
+        <w:ind w:firstLine="0" w:left="283"/>
+      </w:pPr>
+      <w:r>
+        <w:rPr>
+          <w:rFonts w:ascii="Times New Roman" w:hAnsi="Times New Roman" w:eastAsia="Times New Roman"/>
+          <w:b w:val="0"/>
+          <w:i w:val="0"/>
+          <w:color w:val="000000"/>
+          <w:sz w:val="24"/>
+        </w:rPr>
+        <w:t>4.1 Introduction</w:t>
+      </w:r>
+    </w:p>
+    <w:p>
+      <w:pPr>
+        <w:spacing w:after="80" w:before="0" w:line="360" w:lineRule="auto"/>
+        <w:ind w:firstLine="0" w:left="283"/>
+      </w:pPr>
+      <w:r>
+        <w:rPr>
+          <w:rFonts w:ascii="Times New Roman" w:hAnsi="Times New Roman" w:eastAsia="Times New Roman"/>
+          <w:b w:val="0"/>
+          <w:i w:val="0"/>
+          <w:color w:val="000000"/>
+          <w:sz w:val="24"/>
+        </w:rPr>
+        <w:t>4.2 Stakeholder and User Analysis</w:t>
+      </w:r>
+    </w:p>
+    <w:p>
+      <w:pPr>
+        <w:spacing w:after="80" w:before="0" w:line="360" w:lineRule="auto"/>
+        <w:ind w:firstLine="0" w:left="283"/>
+      </w:pPr>
+      <w:r>
+        <w:rPr>
+          <w:rFonts w:ascii="Times New Roman" w:hAnsi="Times New Roman" w:eastAsia="Times New Roman"/>
+          <w:b w:val="0"/>
+          <w:i w:val="0"/>
+          <w:color w:val="000000"/>
+          <w:sz w:val="24"/>
+        </w:rPr>
+        <w:t>4.3 Functional Requirements</w:t>
+      </w:r>
+    </w:p>
+    <w:p>
+      <w:pPr>
+        <w:spacing w:after="80" w:before="0" w:line="360" w:lineRule="auto"/>
+        <w:ind w:firstLine="0" w:left="283"/>
+      </w:pPr>
+      <w:r>
+        <w:rPr>
+          <w:rFonts w:ascii="Times New Roman" w:hAnsi="Times New Roman" w:eastAsia="Times New Roman"/>
+          <w:b w:val="0"/>
+          <w:i w:val="0"/>
+          <w:color w:val="000000"/>
+          <w:sz w:val="24"/>
+        </w:rPr>
+        <w:t>4.4 Non-Functional Requirements</w:t>
+      </w:r>
+    </w:p>
+    <w:p>
+      <w:pPr>
+        <w:spacing w:after="80" w:before="0" w:line="360" w:lineRule="auto"/>
+        <w:ind w:firstLine="0" w:left="283"/>
+      </w:pPr>
+      <w:r>
+        <w:rPr>
+          <w:rFonts w:ascii="Times New Roman" w:hAnsi="Times New Roman" w:eastAsia="Times New Roman"/>
+          <w:b w:val="0"/>
+          <w:i w:val="0"/>
+          <w:color w:val="000000"/>
+          <w:sz w:val="24"/>
+        </w:rPr>
+        <w:t>4.5 Use Cases / User Stories</w:t>
+      </w:r>
+    </w:p>
+    <w:p>
+      <w:pPr>
+        <w:spacing w:after="80" w:before="0" w:line="360" w:lineRule="auto"/>
+        <w:ind w:firstLine="0" w:left="283"/>
+      </w:pPr>
+      <w:r>
+        <w:rPr>
+          <w:rFonts w:ascii="Times New Roman" w:hAnsi="Times New Roman" w:eastAsia="Times New Roman"/>
+          <w:b w:val="0"/>
+          <w:i w:val="0"/>
+          <w:color w:val="000000"/>
+          <w:sz w:val="24"/>
+        </w:rPr>
+        <w:t>4.6 System / Solution Architecture</w:t>
+      </w:r>
+    </w:p>
+    <w:p>
+      <w:pPr>
+        <w:spacing w:after="80" w:before="0" w:line="360" w:lineRule="auto"/>
+        <w:ind w:firstLine="0" w:left="283"/>
+      </w:pPr>
+      <w:r>
+        <w:rPr>
+          <w:rFonts w:ascii="Times New Roman" w:hAnsi="Times New Roman" w:eastAsia="Times New Roman"/>
+          <w:b w:val="0"/>
+          <w:i w:val="0"/>
+          <w:color w:val="000000"/>
+          <w:sz w:val="24"/>
+        </w:rPr>
+        <w:t>4.7 Database / Data Design</w:t>
+      </w:r>
+    </w:p>
+    <w:p>
+      <w:pPr>
+        <w:spacing w:after="80" w:before="0" w:line="360" w:lineRule="auto"/>
+        <w:ind w:firstLine="0" w:left="283"/>
+      </w:pPr>
+      <w:r>
+        <w:rPr>
+          <w:rFonts w:ascii="Times New Roman" w:hAnsi="Times New Roman" w:eastAsia="Times New Roman"/>
+          <w:b w:val="0"/>
+          <w:i w:val="0"/>
+          <w:color w:val="000000"/>
+          <w:sz w:val="24"/>
+        </w:rPr>
+        <w:t>4.8 Interface / Interaction Design</w:t>
+      </w:r>
+    </w:p>
+    <w:p>
+      <w:pPr>
+        <w:spacing w:after="80" w:before="0" w:line="360" w:lineRule="auto"/>
+        <w:ind w:firstLine="0" w:left="283"/>
+      </w:pPr>
+      <w:r>
+        <w:rPr>
+          <w:rFonts w:ascii="Times New Roman" w:hAnsi="Times New Roman" w:eastAsia="Times New Roman"/>
+          <w:b w:val="0"/>
+          <w:i w:val="0"/>
+          <w:color w:val="000000"/>
+          <w:sz w:val="24"/>
+        </w:rPr>
+        <w:t>4.9 Algorithms / Models / Technical Design</w:t>
+      </w:r>
+    </w:p>
+    <w:p>
+      <w:pPr>
+        <w:spacing w:after="80" w:before="0" w:line="360" w:lineRule="auto"/>
+        <w:ind w:firstLine="0" w:left="283"/>
+      </w:pPr>
+      <w:r>
+        <w:rPr>
+          <w:rFonts w:ascii="Times New Roman" w:hAnsi="Times New Roman" w:eastAsia="Times New Roman"/>
+          <w:b w:val="0"/>
+          <w:i w:val="0"/>
+          <w:color w:val="000000"/>
+          <w:sz w:val="24"/>
+        </w:rPr>
+        <w:t>4.10 Chapter Summary</w:t>
+      </w:r>
+    </w:p>
+    <w:p>
+      <w:pPr>
+        <w:spacing w:after="80" w:before="40" w:line="360" w:lineRule="auto"/>
+        <w:ind w:firstLine="0" w:left="0"/>
+      </w:pPr>
+      <w:r>
+        <w:rPr>
+          <w:rFonts w:ascii="Times New Roman" w:hAnsi="Times New Roman" w:eastAsia="Times New Roman"/>
+          <w:b/>
+          <w:i w:val="0"/>
+          <w:color w:val="000000"/>
+          <w:sz w:val="24"/>
+        </w:rPr>
+        <w:t>Chapter 5  Implementation / Development</w:t>
+      </w:r>
+    </w:p>
+    <w:p>
+      <w:pPr>
+        <w:spacing w:after="80" w:before="0" w:line="360" w:lineRule="auto"/>
+        <w:ind w:firstLine="0" w:left="283"/>
+      </w:pPr>
+      <w:r>
+        <w:rPr>
+          <w:rFonts w:ascii="Times New Roman" w:hAnsi="Times New Roman" w:eastAsia="Times New Roman"/>
+          <w:b w:val="0"/>
+          <w:i w:val="0"/>
+          <w:color w:val="000000"/>
+          <w:sz w:val="24"/>
+        </w:rPr>
+        <w:t>5.1 Introduction</w:t>
+      </w:r>
+    </w:p>
+    <w:p>
+      <w:pPr>
+        <w:spacing w:after="80" w:before="0" w:line="360" w:lineRule="auto"/>
+        <w:ind w:firstLine="0" w:left="283"/>
+      </w:pPr>
+      <w:r>
+        <w:rPr>
+          <w:rFonts w:ascii="Times New Roman" w:hAnsi="Times New Roman" w:eastAsia="Times New Roman"/>
+          <w:b w:val="0"/>
+          <w:i w:val="0"/>
+          <w:color w:val="000000"/>
+          <w:sz w:val="24"/>
+        </w:rPr>
+        <w:t>5.2 Development Environment</w:t>
+      </w:r>
+    </w:p>
+    <w:p>
+      <w:pPr>
+        <w:spacing w:after="80" w:before="0" w:line="360" w:lineRule="auto"/>
+        <w:ind w:firstLine="0" w:left="283"/>
+      </w:pPr>
+      <w:r>
+        <w:rPr>
+          <w:rFonts w:ascii="Times New Roman" w:hAnsi="Times New Roman" w:eastAsia="Times New Roman"/>
+          <w:b w:val="0"/>
+          <w:i w:val="0"/>
+          <w:color w:val="000000"/>
+          <w:sz w:val="24"/>
+        </w:rPr>
+        <w:t>5.3 System Components / Modules</w:t>
+      </w:r>
+    </w:p>
+    <w:p>
+      <w:pPr>
+        <w:spacing w:after="80" w:before="0" w:line="360" w:lineRule="auto"/>
+        <w:ind w:firstLine="0" w:left="283"/>
+      </w:pPr>
+      <w:r>
+        <w:rPr>
+          <w:rFonts w:ascii="Times New Roman" w:hAnsi="Times New Roman" w:eastAsia="Times New Roman"/>
+          <w:b w:val="0"/>
+          <w:i w:val="0"/>
+          <w:color w:val="000000"/>
+          <w:sz w:val="24"/>
+        </w:rPr>
+        <w:t>5.4 Key Implementation Details</w:t>
+      </w:r>
+    </w:p>
+    <w:p>
+      <w:pPr>
+        <w:spacing w:after="80" w:before="0" w:line="360" w:lineRule="auto"/>
+        <w:ind w:firstLine="0" w:left="283"/>
+      </w:pPr>
+      <w:r>
+        <w:rPr>
+          <w:rFonts w:ascii="Times New Roman" w:hAnsi="Times New Roman" w:eastAsia="Times New Roman"/>
+          <w:b w:val="0"/>
+          <w:i w:val="0"/>
+          <w:color w:val="000000"/>
+          <w:sz w:val="24"/>
+        </w:rPr>
+        <w:t>5.5 Integration</w:t>
+      </w:r>
+    </w:p>
+    <w:p>
+      <w:pPr>
+        <w:spacing w:after="80" w:before="0" w:line="360" w:lineRule="auto"/>
+        <w:ind w:firstLine="0" w:left="283"/>
+      </w:pPr>
+      <w:r>
+        <w:rPr>
+          <w:rFonts w:ascii="Times New Roman" w:hAnsi="Times New Roman" w:eastAsia="Times New Roman"/>
+          <w:b w:val="0"/>
+          <w:i w:val="0"/>
+          <w:color w:val="000000"/>
+          <w:sz w:val="24"/>
+        </w:rPr>
+        <w:t>5.6 Challenges and Solutions</w:t>
+      </w:r>
+    </w:p>
+    <w:p>
+      <w:pPr>
+        <w:spacing w:after="80" w:before="0" w:line="360" w:lineRule="auto"/>
+        <w:ind w:firstLine="0" w:left="283"/>
+      </w:pPr>
+      <w:r>
+        <w:rPr>
+          <w:rFonts w:ascii="Times New Roman" w:hAnsi="Times New Roman" w:eastAsia="Times New Roman"/>
+          <w:b w:val="0"/>
+          <w:i w:val="0"/>
+          <w:color w:val="000000"/>
+          <w:sz w:val="24"/>
+        </w:rPr>
+        <w:t>5.7 Individual Contribution (group projects)</w:t>
+      </w:r>
+    </w:p>
+    <w:p>
+      <w:pPr>
+        <w:spacing w:after="80" w:before="0" w:line="360" w:lineRule="auto"/>
+        <w:ind w:firstLine="0" w:left="283"/>
+      </w:pPr>
+      <w:r>
+        <w:rPr>
+          <w:rFonts w:ascii="Times New Roman" w:hAnsi="Times New Roman" w:eastAsia="Times New Roman"/>
+          <w:b w:val="0"/>
+          <w:i w:val="0"/>
+          <w:color w:val="000000"/>
+          <w:sz w:val="24"/>
+        </w:rPr>
+        <w:t>5.8 Chapter Summary</w:t>
+      </w:r>
+    </w:p>
+    <w:p>
+      <w:pPr>
+        <w:spacing w:after="80" w:before="40" w:line="360" w:lineRule="auto"/>
+        <w:ind w:firstLine="0" w:left="0"/>
+      </w:pPr>
+      <w:r>
+        <w:rPr>
+          <w:rFonts w:ascii="Times New Roman" w:hAnsi="Times New Roman" w:eastAsia="Times New Roman"/>
+          <w:b/>
+          <w:i w:val="0"/>
+          <w:color w:val="000000"/>
+          <w:sz w:val="24"/>
+        </w:rPr>
+        <w:t>Chapter 6  Testing, Results and Evaluation</w:t>
+      </w:r>
+    </w:p>
+    <w:p>
+      <w:pPr>
+        <w:spacing w:after="80" w:before="0" w:line="360" w:lineRule="auto"/>
+        <w:ind w:firstLine="0" w:left="283"/>
+      </w:pPr>
+      <w:r>
+        <w:rPr>
+          <w:rFonts w:ascii="Times New Roman" w:hAnsi="Times New Roman" w:eastAsia="Times New Roman"/>
+          <w:b w:val="0"/>
+          <w:i w:val="0"/>
+          <w:color w:val="000000"/>
+          <w:sz w:val="24"/>
+        </w:rPr>
+        <w:t>6.1 Introduction</w:t>
+      </w:r>
+    </w:p>
+    <w:p>
+      <w:pPr>
+        <w:spacing w:after="80" w:before="0" w:line="360" w:lineRule="auto"/>
+        <w:ind w:firstLine="0" w:left="283"/>
+      </w:pPr>
+      <w:r>
+        <w:rPr>
+          <w:rFonts w:ascii="Times New Roman" w:hAnsi="Times New Roman" w:eastAsia="Times New Roman"/>
+          <w:b w:val="0"/>
+          <w:i w:val="0"/>
+          <w:color w:val="000000"/>
+          <w:sz w:val="24"/>
+        </w:rPr>
+        <w:t>6.2 Testing Strategy</w:t>
+      </w:r>
+    </w:p>
+    <w:p>
+      <w:pPr>
+        <w:spacing w:after="80" w:before="0" w:line="360" w:lineRule="auto"/>
+        <w:ind w:firstLine="0" w:left="283"/>
+      </w:pPr>
+      <w:r>
+        <w:rPr>
+          <w:rFonts w:ascii="Times New Roman" w:hAnsi="Times New Roman" w:eastAsia="Times New Roman"/>
+          <w:b w:val="0"/>
+          <w:i w:val="0"/>
+          <w:color w:val="000000"/>
+          <w:sz w:val="24"/>
+        </w:rPr>
+        <w:t>6.3 Test Cases and Results</w:t>
+      </w:r>
+    </w:p>
+    <w:p>
+      <w:pPr>
+        <w:spacing w:after="80" w:before="0" w:line="360" w:lineRule="auto"/>
+        <w:ind w:firstLine="0" w:left="283"/>
+      </w:pPr>
+      <w:r>
+        <w:rPr>
+          <w:rFonts w:ascii="Times New Roman" w:hAnsi="Times New Roman" w:eastAsia="Times New Roman"/>
+          <w:b w:val="0"/>
+          <w:i w:val="0"/>
+          <w:color w:val="000000"/>
+          <w:sz w:val="24"/>
+        </w:rPr>
+        <w:t>6.4 Experimental Results</w:t>
+      </w:r>
+    </w:p>
+    <w:p>
+      <w:pPr>
+        <w:spacing w:after="80" w:before="0" w:line="360" w:lineRule="auto"/>
+        <w:ind w:firstLine="0" w:left="283"/>
+      </w:pPr>
+      <w:r>
+        <w:rPr>
+          <w:rFonts w:ascii="Times New Roman" w:hAnsi="Times New Roman" w:eastAsia="Times New Roman"/>
+          <w:b w:val="0"/>
+          <w:i w:val="0"/>
+          <w:color w:val="000000"/>
+          <w:sz w:val="24"/>
+        </w:rPr>
+        <w:t>6.5 User Evaluation</w:t>
+      </w:r>
+    </w:p>
+    <w:p>
+      <w:pPr>
+        <w:spacing w:after="80" w:before="0" w:line="360" w:lineRule="auto"/>
+        <w:ind w:firstLine="0" w:left="283"/>
+      </w:pPr>
+      <w:r>
+        <w:rPr>
+          <w:rFonts w:ascii="Times New Roman" w:hAnsi="Times New Roman" w:eastAsia="Times New Roman"/>
+          <w:b w:val="0"/>
+          <w:i w:val="0"/>
+          <w:color w:val="000000"/>
+          <w:sz w:val="24"/>
+        </w:rPr>
+        <w:t>6.6 Analysis of Results</w:t>
+      </w:r>
+    </w:p>
+    <w:p>
+      <w:pPr>
+        <w:spacing w:after="80" w:before="0" w:line="360" w:lineRule="auto"/>
+        <w:ind w:firstLine="0" w:left="283"/>
+      </w:pPr>
+      <w:r>
+        <w:rPr>
+          <w:rFonts w:ascii="Times New Roman" w:hAnsi="Times New Roman" w:eastAsia="Times New Roman"/>
+          <w:b w:val="0"/>
+          <w:i w:val="0"/>
+          <w:color w:val="000000"/>
+          <w:sz w:val="24"/>
+        </w:rPr>
+        <w:t>6.7 Objective-by-Objective Evaluation</w:t>
+      </w:r>
+    </w:p>
+    <w:p>
+      <w:pPr>
+        <w:spacing w:after="80" w:before="0" w:line="360" w:lineRule="auto"/>
+        <w:ind w:firstLine="0" w:left="283"/>
+      </w:pPr>
+      <w:r>
+        <w:rPr>
+          <w:rFonts w:ascii="Times New Roman" w:hAnsi="Times New Roman" w:eastAsia="Times New Roman"/>
+          <w:b w:val="0"/>
+          <w:i w:val="0"/>
+          <w:color w:val="000000"/>
+          <w:sz w:val="24"/>
+        </w:rPr>
+        <w:t>6.8 Individual Results</w:t>
+      </w:r>
+    </w:p>
+    <w:p>
+      <w:pPr>
+        <w:spacing w:after="80" w:before="0" w:line="360" w:lineRule="auto"/>
+        <w:ind w:firstLine="0" w:left="283"/>
+      </w:pPr>
+      <w:r>
+        <w:rPr>
+          <w:rFonts w:ascii="Times New Roman" w:hAnsi="Times New Roman" w:eastAsia="Times New Roman"/>
+          <w:b w:val="0"/>
+          <w:i w:val="0"/>
+          <w:color w:val="000000"/>
+          <w:sz w:val="24"/>
+        </w:rPr>
+        <w:t>6.9 Chapter Summary</w:t>
+      </w:r>
+    </w:p>
+    <w:p>
+      <w:pPr>
+        <w:spacing w:after="80" w:before="40" w:line="360" w:lineRule="auto"/>
+        <w:ind w:firstLine="0" w:left="0"/>
+      </w:pPr>
+      <w:r>
+        <w:rPr>
+          <w:rFonts w:ascii="Times New Roman" w:hAnsi="Times New Roman" w:eastAsia="Times New Roman"/>
+          <w:b/>
+          <w:i w:val="0"/>
+          <w:color w:val="000000"/>
+          <w:sz w:val="24"/>
+        </w:rPr>
+        <w:t>Chapter 7  Discussion</w:t>
+      </w:r>
+    </w:p>
+    <w:p>
+      <w:pPr>
+        <w:spacing w:after="80" w:before="0" w:line="360" w:lineRule="auto"/>
+        <w:ind w:firstLine="0" w:left="283"/>
+      </w:pPr>
+      <w:r>
+        <w:rPr>
+          <w:rFonts w:ascii="Times New Roman" w:hAnsi="Times New Roman" w:eastAsia="Times New Roman"/>
+          <w:b w:val="0"/>
+          <w:i w:val="0"/>
+          <w:color w:val="000000"/>
+          <w:sz w:val="24"/>
+        </w:rPr>
+        <w:t>7.1 Introduction</w:t>
+      </w:r>
+    </w:p>
+    <w:p>
+      <w:pPr>
+        <w:spacing w:after="80" w:before="0" w:line="360" w:lineRule="auto"/>
+        <w:ind w:firstLine="0" w:left="283"/>
+      </w:pPr>
+      <w:r>
+        <w:rPr>
+          <w:rFonts w:ascii="Times New Roman" w:hAnsi="Times New Roman" w:eastAsia="Times New Roman"/>
+          <w:b w:val="0"/>
+          <w:i w:val="0"/>
+          <w:color w:val="000000"/>
+          <w:sz w:val="24"/>
+        </w:rPr>
+        <w:t>7.2 Interpretation of Findings</w:t>
+      </w:r>
+    </w:p>
+    <w:p>
+      <w:pPr>
+        <w:spacing w:after="80" w:before="0" w:line="360" w:lineRule="auto"/>
+        <w:ind w:firstLine="0" w:left="283"/>
+      </w:pPr>
+      <w:r>
+        <w:rPr>
+          <w:rFonts w:ascii="Times New Roman" w:hAnsi="Times New Roman" w:eastAsia="Times New Roman"/>
+          <w:b w:val="0"/>
+          <w:i w:val="0"/>
+          <w:color w:val="000000"/>
+          <w:sz w:val="24"/>
+        </w:rPr>
+        <w:t>7.3 Comparison with Existing Work</w:t>
+      </w:r>
+    </w:p>
+    <w:p>
+      <w:pPr>
+        <w:spacing w:after="80" w:before="0" w:line="360" w:lineRule="auto"/>
+        <w:ind w:firstLine="0" w:left="283"/>
+      </w:pPr>
+      <w:r>
+        <w:rPr>
+          <w:rFonts w:ascii="Times New Roman" w:hAnsi="Times New Roman" w:eastAsia="Times New Roman"/>
+          <w:b w:val="0"/>
+          <w:i w:val="0"/>
+          <w:color w:val="000000"/>
+          <w:sz w:val="24"/>
+        </w:rPr>
+        <w:t>7.4 Contributions of the Project</w:t>
+      </w:r>
+    </w:p>
+    <w:p>
+      <w:pPr>
+        <w:spacing w:after="80" w:before="0" w:line="360" w:lineRule="auto"/>
+        <w:ind w:firstLine="0" w:left="283"/>
+      </w:pPr>
+      <w:r>
+        <w:rPr>
+          <w:rFonts w:ascii="Times New Roman" w:hAnsi="Times New Roman" w:eastAsia="Times New Roman"/>
+          <w:b w:val="0"/>
+          <w:i w:val="0"/>
+          <w:color w:val="000000"/>
+          <w:sz w:val="24"/>
+        </w:rPr>
+        <w:t>7.5 Limitations and Implications</w:t>
+      </w:r>
+    </w:p>
+    <w:p>
+      <w:pPr>
+        <w:spacing w:after="80" w:before="0" w:line="360" w:lineRule="auto"/>
+        <w:ind w:firstLine="0" w:left="283"/>
+      </w:pPr>
+      <w:r>
+        <w:rPr>
+          <w:rFonts w:ascii="Times New Roman" w:hAnsi="Times New Roman" w:eastAsia="Times New Roman"/>
+          <w:b w:val="0"/>
+          <w:i w:val="0"/>
+          <w:color w:val="000000"/>
+          <w:sz w:val="24"/>
+        </w:rPr>
+        <w:t>7.6 Chapter Summary</w:t>
+      </w:r>
+    </w:p>
+    <w:p>
+      <w:pPr>
+        <w:spacing w:after="80" w:before="40" w:line="360" w:lineRule="auto"/>
+        <w:ind w:firstLine="0" w:left="0"/>
+      </w:pPr>
+      <w:r>
+        <w:rPr>
+          <w:rFonts w:ascii="Times New Roman" w:hAnsi="Times New Roman" w:eastAsia="Times New Roman"/>
+          <w:b/>
+          <w:i w:val="0"/>
+          <w:color w:val="000000"/>
+          <w:sz w:val="24"/>
+        </w:rPr>
+        <w:t>Chapter 8  Conclusion and Recommendations</w:t>
+      </w:r>
+    </w:p>
+    <w:p>
+      <w:pPr>
+        <w:spacing w:after="80" w:before="0" w:line="360" w:lineRule="auto"/>
+        <w:ind w:firstLine="0" w:left="283"/>
+      </w:pPr>
+      <w:r>
+        <w:rPr>
+          <w:rFonts w:ascii="Times New Roman" w:hAnsi="Times New Roman" w:eastAsia="Times New Roman"/>
+          <w:b w:val="0"/>
+          <w:i w:val="0"/>
+          <w:color w:val="000000"/>
+          <w:sz w:val="24"/>
+        </w:rPr>
+        <w:t>8.1 Introduction</w:t>
+      </w:r>
+    </w:p>
+    <w:p>
+      <w:pPr>
+        <w:spacing w:after="80" w:before="0" w:line="360" w:lineRule="auto"/>
+        <w:ind w:firstLine="0" w:left="283"/>
+      </w:pPr>
+      <w:r>
+        <w:rPr>
+          <w:rFonts w:ascii="Times New Roman" w:hAnsi="Times New Roman" w:eastAsia="Times New Roman"/>
+          <w:b w:val="0"/>
+          <w:i w:val="0"/>
+          <w:color w:val="000000"/>
+          <w:sz w:val="24"/>
+        </w:rPr>
+        <w:t>8.2 Summary of the Project</w:t>
+      </w:r>
+    </w:p>
+    <w:p>
+      <w:pPr>
+        <w:spacing w:after="80" w:before="0" w:line="360" w:lineRule="auto"/>
+        <w:ind w:firstLine="0" w:left="283"/>
+      </w:pPr>
+      <w:r>
+        <w:rPr>
+          <w:rFonts w:ascii="Times New Roman" w:hAnsi="Times New Roman" w:eastAsia="Times New Roman"/>
+          <w:b w:val="0"/>
+          <w:i w:val="0"/>
+          <w:color w:val="000000"/>
+          <w:sz w:val="24"/>
+        </w:rPr>
+        <w:t>8.3 Conclusions</w:t>
+      </w:r>
+    </w:p>
+    <w:p>
+      <w:pPr>
+        <w:spacing w:after="80" w:before="0" w:line="360" w:lineRule="auto"/>
+        <w:ind w:firstLine="0" w:left="283"/>
+      </w:pPr>
+      <w:r>
+        <w:rPr>
+          <w:rFonts w:ascii="Times New Roman" w:hAnsi="Times New Roman" w:eastAsia="Times New Roman"/>
+          <w:b w:val="0"/>
+          <w:i w:val="0"/>
+          <w:color w:val="000000"/>
+          <w:sz w:val="24"/>
+        </w:rPr>
+        <w:t>8.4 Achievement of Objectives</w:t>
+      </w:r>
+    </w:p>
+    <w:p>
+      <w:pPr>
+        <w:spacing w:after="80" w:before="0" w:line="360" w:lineRule="auto"/>
+        <w:ind w:firstLine="0" w:left="283"/>
+      </w:pPr>
+      <w:r>
+        <w:rPr>
+          <w:rFonts w:ascii="Times New Roman" w:hAnsi="Times New Roman" w:eastAsia="Times New Roman"/>
+          <w:b w:val="0"/>
+          <w:i w:val="0"/>
+          <w:color w:val="000000"/>
+          <w:sz w:val="24"/>
+        </w:rPr>
+        <w:t>8.5 Recommendations</w:t>
+      </w:r>
+    </w:p>
+    <w:p>
+      <w:pPr>
+        <w:spacing w:after="80" w:before="0" w:line="360" w:lineRule="auto"/>
+        <w:ind w:firstLine="0" w:left="283"/>
+      </w:pPr>
+      <w:r>
+        <w:rPr>
+          <w:rFonts w:ascii="Times New Roman" w:hAnsi="Times New Roman" w:eastAsia="Times New Roman"/>
+          <w:b w:val="0"/>
+          <w:i w:val="0"/>
+          <w:color w:val="000000"/>
+          <w:sz w:val="24"/>
+        </w:rPr>
+        <w:t>8.6 Future Work</w:t>
+      </w:r>
+    </w:p>
+    <w:p>
+      <w:pPr>
+        <w:spacing w:after="80" w:before="40" w:line="360" w:lineRule="auto"/>
+        <w:ind w:firstLine="0" w:left="0"/>
+      </w:pPr>
+      <w:r>
+        <w:rPr>
+          <w:rFonts w:ascii="Times New Roman" w:hAnsi="Times New Roman" w:eastAsia="Times New Roman"/>
+          <w:b/>
+          <w:i w:val="0"/>
+          <w:color w:val="000000"/>
+          <w:sz w:val="24"/>
+        </w:rPr>
+        <w:t>REFERENCES</w:t>
+      </w:r>
+    </w:p>
+    <w:p>
+      <w:pPr>
+        <w:spacing w:after="80" w:before="40" w:line="360" w:lineRule="auto"/>
+        <w:ind w:firstLine="0" w:left="0"/>
+      </w:pPr>
+      <w:r>
+        <w:rPr>
+          <w:rFonts w:ascii="Times New Roman" w:hAnsi="Times New Roman" w:eastAsia="Times New Roman"/>
+          <w:b/>
+          <w:i w:val="0"/>
+          <w:color w:val="000000"/>
+          <w:sz w:val="24"/>
+        </w:rPr>
+        <w:t>Appendix A  Individual Contribution Statement</w:t>
+      </w:r>
+    </w:p>
+    <w:p>
+      <w:pPr>
+        <w:spacing w:after="80" w:before="0" w:line="360" w:lineRule="auto"/>
+        <w:ind w:firstLine="0" w:left="283"/>
+      </w:pPr>
+      <w:r>
+        <w:rPr>
+          <w:rFonts w:ascii="Times New Roman" w:hAnsi="Times New Roman" w:eastAsia="Times New Roman"/>
+          <w:b w:val="0"/>
+          <w:i w:val="0"/>
+          <w:color w:val="000000"/>
+          <w:sz w:val="24"/>
+        </w:rPr>
+        <w:t>A.1 Project and Group Information</w:t>
+      </w:r>
+    </w:p>
+    <w:p>
+      <w:pPr>
+        <w:spacing w:after="80" w:before="0" w:line="360" w:lineRule="auto"/>
+        <w:ind w:firstLine="0" w:left="283"/>
+      </w:pPr>
+      <w:r>
+        <w:rPr>
+          <w:rFonts w:ascii="Times New Roman" w:hAnsi="Times New Roman" w:eastAsia="Times New Roman"/>
+          <w:b w:val="0"/>
+          <w:i w:val="0"/>
+          <w:color w:val="000000"/>
+          <w:sz w:val="24"/>
+        </w:rPr>
+        <w:t>A.2 Overall Group Project</w:t>
+      </w:r>
+    </w:p>
+    <w:p>
+      <w:pPr>
+        <w:spacing w:after="80" w:before="0" w:line="360" w:lineRule="auto"/>
+        <w:ind w:firstLine="0" w:left="283"/>
+      </w:pPr>
+      <w:r>
+        <w:rPr>
+          <w:rFonts w:ascii="Times New Roman" w:hAnsi="Times New Roman" w:eastAsia="Times New Roman"/>
+          <w:b w:val="0"/>
+          <w:i w:val="0"/>
+          <w:color w:val="000000"/>
+          <w:sz w:val="24"/>
+        </w:rPr>
+        <w:t>A.3 Individual Role and Responsibilities</w:t>
+      </w:r>
+    </w:p>
+    <w:p>
+      <w:pPr>
+        <w:spacing w:after="80" w:before="0" w:line="360" w:lineRule="auto"/>
+        <w:ind w:firstLine="0" w:left="283"/>
+      </w:pPr>
+      <w:r>
+        <w:rPr>
+          <w:rFonts w:ascii="Times New Roman" w:hAnsi="Times New Roman" w:eastAsia="Times New Roman"/>
+          <w:b w:val="0"/>
+          <w:i w:val="0"/>
+          <w:color w:val="000000"/>
+          <w:sz w:val="24"/>
+        </w:rPr>
+        <w:t>A.4 Collaboration and Co-author Work</w:t>
+      </w:r>
+    </w:p>
+    <w:p>
+      <w:pPr>
+        <w:spacing w:after="80" w:before="40" w:line="360" w:lineRule="auto"/>
+        <w:ind w:firstLine="0" w:left="0"/>
+      </w:pPr>
+      <w:r>
+        <w:rPr>
+          <w:rFonts w:ascii="Times New Roman" w:hAnsi="Times New Roman" w:eastAsia="Times New Roman"/>
+          <w:b/>
+          <w:i w:val="0"/>
+          <w:color w:val="000000"/>
+          <w:sz w:val="24"/>
+        </w:rPr>
+        <w:t>Appendix B  User Manual / Installation Guide (summary)</w:t>
       </w:r>
     </w:p>
     <w:p>
@@ -1148,7 +2513,7 @@
                 <w:color w:val="000000"/>
                 <w:sz w:val="22"/>
               </w:rPr>
-              <w:t>SPA</w:t>
+              <w:t>UI</w:t>
             </w:r>
           </w:p>
         </w:tc>
@@ -1168,7 +2533,7 @@
                 <w:color w:val="000000"/>
                 <w:sz w:val="22"/>
               </w:rPr>
-              <w:t>Single-Page Application</w:t>
+              <w:t>User Interface</w:t>
             </w:r>
           </w:p>
         </w:tc>
@@ -1191,7 +2556,7 @@
                 <w:color w:val="000000"/>
                 <w:sz w:val="22"/>
               </w:rPr>
-              <w:t>UI</w:t>
+              <w:t>VAT</w:t>
             </w:r>
           </w:p>
         </w:tc>
@@ -1199,48 +2564,6 @@
           <w:tcPr>
             <w:tcW w:type="dxa" w:w="4513"/>
             <w:shd w:fill="F3F6F8" w:val="clear"/>
-          </w:tcPr>
-          <w:p>
-            <w:pPr>
-              <w:spacing w:before="40" w:after="40"/>
-            </w:pPr>
-            <w:r>
-              <w:rPr>
-                <w:rFonts w:ascii="Times New Roman" w:hAnsi="Times New Roman" w:eastAsia="Times New Roman"/>
-                <w:b w:val="0"/>
-                <w:i w:val="0"/>
-                <w:color w:val="000000"/>
-                <w:sz w:val="22"/>
-              </w:rPr>
-              <w:t>User Interface</w:t>
-            </w:r>
-          </w:p>
-        </w:tc>
-      </w:tr>
-      <w:tr>
-        <w:tc>
-          <w:tcPr>
-            <w:tcW w:type="dxa" w:w="4513"/>
-          </w:tcPr>
-          <w:p>
-            <w:pPr>
-              <w:spacing w:before="40" w:after="40"/>
-            </w:pPr>
-            <w:r>
-              <w:rPr>
-                <w:rFonts w:ascii="Times New Roman" w:hAnsi="Times New Roman" w:eastAsia="Times New Roman"/>
-                <w:b w:val="0"/>
-                <w:i w:val="0"/>
-                <w:color w:val="000000"/>
-                <w:sz w:val="22"/>
-              </w:rPr>
-              <w:t>VAT</w:t>
-            </w:r>
-          </w:p>
-        </w:tc>
-        <w:tc>
-          <w:tcPr>
-            <w:tcW w:type="dxa" w:w="4513"/>
           </w:tcPr>
           <w:p>
             <w:pPr>
@@ -1263,7 +2586,6 @@
         <w:tc>
           <w:tcPr>
             <w:tcW w:type="dxa" w:w="4513"/>
-            <w:shd w:fill="F3F6F8" w:val="clear"/>
           </w:tcPr>
           <w:p>
             <w:pPr>
@@ -1284,7 +2606,6 @@
         <w:tc>
           <w:tcPr>
             <w:tcW w:type="dxa" w:w="4513"/>
-            <w:shd w:fill="F3F6F8" w:val="clear"/>
           </w:tcPr>
           <w:p>
             <w:pPr>
@@ -1306,9 +2627,17 @@
     </w:tbl>
     <w:p/>
     <w:p>
-      <w:r>
-        <w:br w:type="page"/>
-      </w:r>
+      <w:pPr>
+        <w:sectPr>
+          <w:footerReference w:type="default" r:id="rId9"/>
+          <w:pgSz w:w="11906" w:h="16838"/>
+          <w:pgMar w:top="1440" w:right="1440" w:bottom="1440" w:left="1440" w:header="720" w:footer="720" w:gutter="0"/>
+          <w:cols w:space="720"/>
+          <w:titlePg/>
+          <w:docGrid w:linePitch="360"/>
+          <w:pgNumType w:fmt="lowerRoman" w:start="1"/>
+        </w:sectPr>
+      </w:pPr>
     </w:p>
     <w:p>
       <w:pPr>
@@ -1851,7 +3180,7 @@
           <w:color w:val="000000"/>
           <w:sz w:val="24"/>
         </w:rPr>
-        <w:t>Auto FX seeds the rate at **20** (or the last fetched cache) until the user clicks Fetch FX or types a rate. Live FX varies; spreadsheet/pytest oracles for Demo B therefore pin **27.50** for reproducibility — that is an evaluation rate, not the UI starter. Value-based allocation exists in the engine but is not primary in the UI. The MVP assumes honest paperwork totals and does not replace clearing agents.</w:t>
+        <w:t>Auto FX seeds the rate at **20** (or the last fetched cache) until the user clicks Fetch FX or types a rate. Demo B spreadsheet/pytest oracles use the same **20** so the UI starter and evaluation rate match. Live Fetch FX may differ; keep 20 for the frozen demo. Value-based allocation exists in the engine but is not primary in the UI. The MVP assumes honest paperwork totals and does not replace clearing agents.</w:t>
       </w:r>
     </w:p>
     <w:p>
@@ -2872,7 +4201,7 @@
                     <pic:cNvPicPr/>
                   </pic:nvPicPr>
                   <pic:blipFill>
-                    <a:blip r:embed="rId12"/>
+                    <a:blip r:embed="rId13"/>
                     <a:stretch>
                       <a:fillRect/>
                     </a:stretch>
@@ -3086,7 +4415,7 @@
           <w:color w:val="000000"/>
           <w:sz w:val="24"/>
         </w:rPr>
-        <w:t>Architecture is three-tier: React SPA → FastAPI /api/v1 → PostgreSQL (SQLite fallback), with optional FX providers. The True Cost workflow is allocate → suggest/adjust → commit → Cost history.</w:t>
+        <w:t>Architecture is three-tier: React frontend → FastAPI /api/v1 → PostgreSQL (SQLite fallback), with optional FX providers. The True Cost workflow is allocate → suggest/adjust → commit → Cost history.</w:t>
       </w:r>
     </w:p>
     <w:p>
@@ -3111,7 +4440,7 @@
                     <pic:cNvPicPr/>
                   </pic:nvPicPr>
                   <pic:blipFill>
-                    <a:blip r:embed="rId13"/>
+                    <a:blip r:embed="rId14"/>
                     <a:stretch>
                       <a:fillRect/>
                     </a:stretch>
@@ -4098,7 +5427,7 @@
           <w:color w:val="000000"/>
           <w:sz w:val="24"/>
         </w:rPr>
-        <w:t>As an admin, I open Auto FX (rate starts at 20 / last cache), Fetch FX or set 27.50 for the oracle, and cost by weight.</w:t>
+        <w:t>As an admin, I open Auto FX at rate 20 (CSV / UI starter), allocate by weight, and cost Demo B.</w:t>
       </w:r>
     </w:p>
     <w:p>
@@ -4172,7 +5501,7 @@
                     <pic:cNvPicPr/>
                   </pic:nvPicPr>
                   <pic:blipFill>
-                    <a:blip r:embed="rId13"/>
+                    <a:blip r:embed="rId14"/>
                     <a:stretch>
                       <a:fillRect/>
                     </a:stretch>
@@ -4262,7 +5591,7 @@
                     <pic:cNvPicPr/>
                   </pic:nvPicPr>
                   <pic:blipFill>
-                    <a:blip r:embed="rId14"/>
+                    <a:blip r:embed="rId15"/>
                     <a:stretch>
                       <a:fillRect/>
                     </a:stretch>
@@ -4327,7 +5656,7 @@
           <w:color w:val="000000"/>
           <w:sz w:val="24"/>
         </w:rPr>
-        <w:t>The UI is a React SPA with Welcome, Login/Create account, Dashboard, Products, Shipments (CSV import, Clear drafts), Shipment detail (Fetch FX), True Cost studio (Lines → Allocate → Price → Commit), Stock, and Cost history (When / What). Themes and a closable sidebar support desk use.</w:t>
+        <w:t>The UI is a React frontend with Welcome, Login/Create account, Dashboard, Products, Shipments (CSV import, Clear drafts), Shipment detail (Fetch FX), True Cost studio (Lines → Allocate → Price → Commit), Stock, and Cost history (When / What). Themes and a closable sidebar support desk use. Figures 4.4–4.8 are as-built screenshots of the working MVP.</w:t>
       </w:r>
     </w:p>
     <w:p>
@@ -4352,7 +5681,7 @@
                     <pic:cNvPicPr/>
                   </pic:nvPicPr>
                   <pic:blipFill>
-                    <a:blip r:embed="rId15"/>
+                    <a:blip r:embed="rId16"/>
                     <a:stretch>
                       <a:fillRect/>
                     </a:stretch>
@@ -4386,6 +5715,376 @@
           <w:sz w:val="22"/>
         </w:rPr>
         <w:t>Figure 4.3: True Cost interaction flow</w:t>
+      </w:r>
+    </w:p>
+    <w:p>
+      <w:pPr>
+        <w:spacing w:after="200" w:before="0" w:line="360" w:lineRule="auto"/>
+        <w:ind w:firstLine="709"/>
+      </w:pPr>
+      <w:r>
+        <w:rPr>
+          <w:rFonts w:ascii="Times New Roman" w:hAnsi="Times New Roman" w:eastAsia="Times New Roman"/>
+          <w:b w:val="0"/>
+          <w:i w:val="0"/>
+          <w:color w:val="000000"/>
+          <w:sz w:val="24"/>
+        </w:rPr>
+        <w:t>The Dashboard summarises units available, low/out counts, draft versus committed batches, and a short on-the-shelf list so the administrator can see status before opening True Cost.</w:t>
+      </w:r>
+    </w:p>
+    <w:p>
+      <w:pPr>
+        <w:spacing w:before="120"/>
+        <w:ind w:firstLine="0"/>
+        <w:jc w:val="center"/>
+      </w:pPr>
+      <w:r>
+        <w:drawing>
+          <wp:inline xmlns:a="http://schemas.openxmlformats.org/drawingml/2006/main" xmlns:pic="http://schemas.openxmlformats.org/drawingml/2006/picture">
+            <wp:extent cx="5577840" cy="2668744"/>
+            <wp:docPr id="8" name="Picture 8"/>
+            <wp:cNvGraphicFramePr>
+              <a:graphicFrameLocks noChangeAspect="1"/>
+            </wp:cNvGraphicFramePr>
+            <a:graphic>
+              <a:graphicData uri="http://schemas.openxmlformats.org/drawingml/2006/picture">
+                <pic:pic>
+                  <pic:nvPicPr>
+                    <pic:cNvPr id="0" name="ui_dashboard.png"/>
+                    <pic:cNvPicPr/>
+                  </pic:nvPicPr>
+                  <pic:blipFill>
+                    <a:blip r:embed="rId17"/>
+                    <a:stretch>
+                      <a:fillRect/>
+                    </a:stretch>
+                  </pic:blipFill>
+                  <pic:spPr>
+                    <a:xfrm>
+                      <a:off x="0" y="0"/>
+                      <a:ext cx="5577840" cy="2668744"/>
+                    </a:xfrm>
+                    <a:prstGeom prst="rect"/>
+                  </pic:spPr>
+                </pic:pic>
+              </a:graphicData>
+            </a:graphic>
+          </wp:inline>
+        </w:drawing>
+      </w:r>
+    </w:p>
+    <w:p>
+      <w:pPr>
+        <w:spacing w:before="120" w:after="280"/>
+        <w:ind w:firstLine="0"/>
+        <w:jc w:val="center"/>
+      </w:pPr>
+      <w:r>
+        <w:rPr>
+          <w:rFonts w:ascii="Times New Roman" w:hAnsi="Times New Roman" w:eastAsia="Times New Roman"/>
+          <w:b/>
+          <w:i/>
+          <w:color w:val="000000"/>
+          <w:sz w:val="22"/>
+        </w:rPr>
+        <w:t>Figure 4.4: Dashboard — stock and shipment overview with Start fresh and Open True Cost</w:t>
+      </w:r>
+    </w:p>
+    <w:p>
+      <w:pPr>
+        <w:spacing w:after="200" w:before="0" w:line="360" w:lineRule="auto"/>
+        <w:ind w:firstLine="709"/>
+      </w:pPr>
+      <w:r>
+        <w:rPr>
+          <w:rFonts w:ascii="Times New Roman" w:hAnsi="Times New Roman" w:eastAsia="Times New Roman"/>
+          <w:b w:val="0"/>
+          <w:i w:val="0"/>
+          <w:color w:val="000000"/>
+          <w:sz w:val="24"/>
+        </w:rPr>
+        <w:t>Products supports manual create (optional auto SKU) and Import CSV for demo catalogues. Optional details are folded away to keep the primary form short.</w:t>
+      </w:r>
+    </w:p>
+    <w:p>
+      <w:pPr>
+        <w:spacing w:before="120"/>
+        <w:ind w:firstLine="0"/>
+        <w:jc w:val="center"/>
+      </w:pPr>
+      <w:r>
+        <w:drawing>
+          <wp:inline xmlns:a="http://schemas.openxmlformats.org/drawingml/2006/main" xmlns:pic="http://schemas.openxmlformats.org/drawingml/2006/picture">
+            <wp:extent cx="5577840" cy="2687013"/>
+            <wp:docPr id="9" name="Picture 9"/>
+            <wp:cNvGraphicFramePr>
+              <a:graphicFrameLocks noChangeAspect="1"/>
+            </wp:cNvGraphicFramePr>
+            <a:graphic>
+              <a:graphicData uri="http://schemas.openxmlformats.org/drawingml/2006/picture">
+                <pic:pic>
+                  <pic:nvPicPr>
+                    <pic:cNvPr id="0" name="ui_products.png"/>
+                    <pic:cNvPicPr/>
+                  </pic:nvPicPr>
+                  <pic:blipFill>
+                    <a:blip r:embed="rId18"/>
+                    <a:stretch>
+                      <a:fillRect/>
+                    </a:stretch>
+                  </pic:blipFill>
+                  <pic:spPr>
+                    <a:xfrm>
+                      <a:off x="0" y="0"/>
+                      <a:ext cx="5577840" cy="2687013"/>
+                    </a:xfrm>
+                    <a:prstGeom prst="rect"/>
+                  </pic:spPr>
+                </pic:pic>
+              </a:graphicData>
+            </a:graphic>
+          </wp:inline>
+        </w:drawing>
+      </w:r>
+    </w:p>
+    <w:p>
+      <w:pPr>
+        <w:spacing w:before="120" w:after="280"/>
+        <w:ind w:firstLine="0"/>
+        <w:jc w:val="center"/>
+      </w:pPr>
+      <w:r>
+        <w:rPr>
+          <w:rFonts w:ascii="Times New Roman" w:hAnsi="Times New Roman" w:eastAsia="Times New Roman"/>
+          <w:b/>
+          <w:i/>
+          <w:color w:val="000000"/>
+          <w:sz w:val="22"/>
+        </w:rPr>
+        <w:t>Figure 4.5: Products — catalogue entry form and CSV import</w:t>
+      </w:r>
+    </w:p>
+    <w:p>
+      <w:pPr>
+        <w:spacing w:after="200" w:before="0" w:line="360" w:lineRule="auto"/>
+        <w:ind w:firstLine="709"/>
+      </w:pPr>
+      <w:r>
+        <w:rPr>
+          <w:rFonts w:ascii="Times New Roman" w:hAnsi="Times New Roman" w:eastAsia="Times New Roman"/>
+          <w:b w:val="0"/>
+          <w:i w:val="0"/>
+          <w:color w:val="000000"/>
+          <w:sz w:val="24"/>
+        </w:rPr>
+        <w:t>Primary cost mode is chosen once when the shipment is created; later lines and CSV imports follow that mode. Clear drafts and Import shipment CSV sit in the page actions.</w:t>
+      </w:r>
+    </w:p>
+    <w:p>
+      <w:pPr>
+        <w:spacing w:before="120"/>
+        <w:ind w:firstLine="0"/>
+        <w:jc w:val="center"/>
+      </w:pPr>
+      <w:r>
+        <w:drawing>
+          <wp:inline xmlns:a="http://schemas.openxmlformats.org/drawingml/2006/main" xmlns:pic="http://schemas.openxmlformats.org/drawingml/2006/picture">
+            <wp:extent cx="5577840" cy="2633635"/>
+            <wp:docPr id="10" name="Picture 10"/>
+            <wp:cNvGraphicFramePr>
+              <a:graphicFrameLocks noChangeAspect="1"/>
+            </wp:cNvGraphicFramePr>
+            <a:graphic>
+              <a:graphicData uri="http://schemas.openxmlformats.org/drawingml/2006/picture">
+                <pic:pic>
+                  <pic:nvPicPr>
+                    <pic:cNvPr id="0" name="ui_shipments.png"/>
+                    <pic:cNvPicPr/>
+                  </pic:nvPicPr>
+                  <pic:blipFill>
+                    <a:blip r:embed="rId19"/>
+                    <a:stretch>
+                      <a:fillRect/>
+                    </a:stretch>
+                  </pic:blipFill>
+                  <pic:spPr>
+                    <a:xfrm>
+                      <a:off x="0" y="0"/>
+                      <a:ext cx="5577840" cy="2633635"/>
+                    </a:xfrm>
+                    <a:prstGeom prst="rect"/>
+                  </pic:spPr>
+                </pic:pic>
+              </a:graphicData>
+            </a:graphic>
+          </wp:inline>
+        </w:drawing>
+      </w:r>
+    </w:p>
+    <w:p>
+      <w:pPr>
+        <w:spacing w:before="120" w:after="280"/>
+        <w:ind w:firstLine="0"/>
+        <w:jc w:val="center"/>
+      </w:pPr>
+      <w:r>
+        <w:rPr>
+          <w:rFonts w:ascii="Times New Roman" w:hAnsi="Times New Roman" w:eastAsia="Times New Roman"/>
+          <w:b/>
+          <w:i/>
+          <w:color w:val="000000"/>
+          <w:sz w:val="22"/>
+        </w:rPr>
+        <w:t>Figure 4.6: Shipments — create batch with dual cost mode (Already-Local / Auto FX)</w:t>
+      </w:r>
+    </w:p>
+    <w:p>
+      <w:pPr>
+        <w:spacing w:after="200" w:before="0" w:line="360" w:lineRule="auto"/>
+        <w:ind w:firstLine="709"/>
+      </w:pPr>
+      <w:r>
+        <w:rPr>
+          <w:rFonts w:ascii="Times New Roman" w:hAnsi="Times New Roman" w:eastAsia="Times New Roman"/>
+          <w:b w:val="0"/>
+          <w:i w:val="0"/>
+          <w:color w:val="000000"/>
+          <w:sz w:val="24"/>
+        </w:rPr>
+        <w:t>After allocation, the administrator drags profit margin; suggested retail prices update live. The red mark is the safety floor (10% above landed unit cost).</w:t>
+      </w:r>
+    </w:p>
+    <w:p>
+      <w:pPr>
+        <w:spacing w:before="120"/>
+        <w:ind w:firstLine="0"/>
+        <w:jc w:val="center"/>
+      </w:pPr>
+      <w:r>
+        <w:drawing>
+          <wp:inline xmlns:a="http://schemas.openxmlformats.org/drawingml/2006/main" xmlns:pic="http://schemas.openxmlformats.org/drawingml/2006/picture">
+            <wp:extent cx="5577840" cy="2902377"/>
+            <wp:docPr id="11" name="Picture 11"/>
+            <wp:cNvGraphicFramePr>
+              <a:graphicFrameLocks noChangeAspect="1"/>
+            </wp:cNvGraphicFramePr>
+            <a:graphic>
+              <a:graphicData uri="http://schemas.openxmlformats.org/drawingml/2006/picture">
+                <pic:pic>
+                  <pic:nvPicPr>
+                    <pic:cNvPr id="0" name="ui_true_cost_pricing.png"/>
+                    <pic:cNvPicPr/>
+                  </pic:nvPicPr>
+                  <pic:blipFill>
+                    <a:blip r:embed="rId20"/>
+                    <a:stretch>
+                      <a:fillRect/>
+                    </a:stretch>
+                  </pic:blipFill>
+                  <pic:spPr>
+                    <a:xfrm>
+                      <a:off x="0" y="0"/>
+                      <a:ext cx="5577840" cy="2902377"/>
+                    </a:xfrm>
+                    <a:prstGeom prst="rect"/>
+                  </pic:spPr>
+                </pic:pic>
+              </a:graphicData>
+            </a:graphic>
+          </wp:inline>
+        </w:drawing>
+      </w:r>
+    </w:p>
+    <w:p>
+      <w:pPr>
+        <w:spacing w:before="120" w:after="280"/>
+        <w:ind w:firstLine="0"/>
+        <w:jc w:val="center"/>
+      </w:pPr>
+      <w:r>
+        <w:rPr>
+          <w:rFonts w:ascii="Times New Roman" w:hAnsi="Times New Roman" w:eastAsia="Times New Roman"/>
+          <w:b/>
+          <w:i/>
+          <w:color w:val="000000"/>
+          <w:sz w:val="22"/>
+        </w:rPr>
+        <w:t>Figure 4.7: True Cost — Step 2 retail suggestion with margin slider and safety floor</w:t>
+      </w:r>
+    </w:p>
+    <w:p>
+      <w:pPr>
+        <w:spacing w:after="200" w:before="0" w:line="360" w:lineRule="auto"/>
+        <w:ind w:firstLine="709"/>
+      </w:pPr>
+      <w:r>
+        <w:rPr>
+          <w:rFonts w:ascii="Times New Roman" w:hAnsi="Times New Roman" w:eastAsia="Times New Roman"/>
+          <w:b w:val="0"/>
+          <w:i w:val="0"/>
+          <w:color w:val="000000"/>
+          <w:sz w:val="24"/>
+        </w:rPr>
+        <w:t>Stock shows units on hand by SKU with retail context and a Record sale action that reduces quantity without becoming a full POS.</w:t>
+      </w:r>
+    </w:p>
+    <w:p>
+      <w:pPr>
+        <w:spacing w:before="120"/>
+        <w:ind w:firstLine="0"/>
+        <w:jc w:val="center"/>
+      </w:pPr>
+      <w:r>
+        <w:drawing>
+          <wp:inline xmlns:a="http://schemas.openxmlformats.org/drawingml/2006/main" xmlns:pic="http://schemas.openxmlformats.org/drawingml/2006/picture">
+            <wp:extent cx="5577840" cy="2630435"/>
+            <wp:docPr id="12" name="Picture 12"/>
+            <wp:cNvGraphicFramePr>
+              <a:graphicFrameLocks noChangeAspect="1"/>
+            </wp:cNvGraphicFramePr>
+            <a:graphic>
+              <a:graphicData uri="http://schemas.openxmlformats.org/drawingml/2006/picture">
+                <pic:pic>
+                  <pic:nvPicPr>
+                    <pic:cNvPr id="0" name="ui_stock.png"/>
+                    <pic:cNvPicPr/>
+                  </pic:nvPicPr>
+                  <pic:blipFill>
+                    <a:blip r:embed="rId21"/>
+                    <a:stretch>
+                      <a:fillRect/>
+                    </a:stretch>
+                  </pic:blipFill>
+                  <pic:spPr>
+                    <a:xfrm>
+                      <a:off x="0" y="0"/>
+                      <a:ext cx="5577840" cy="2630435"/>
+                    </a:xfrm>
+                    <a:prstGeom prst="rect"/>
+                  </pic:spPr>
+                </pic:pic>
+              </a:graphicData>
+            </a:graphic>
+          </wp:inline>
+        </w:drawing>
+      </w:r>
+    </w:p>
+    <w:p>
+      <w:pPr>
+        <w:spacing w:before="120" w:after="280"/>
+        <w:ind w:firstLine="0"/>
+        <w:jc w:val="center"/>
+      </w:pPr>
+      <w:r>
+        <w:rPr>
+          <w:rFonts w:ascii="Times New Roman" w:hAnsi="Times New Roman" w:eastAsia="Times New Roman"/>
+          <w:b/>
+          <w:i/>
+          <w:color w:val="000000"/>
+          <w:sz w:val="22"/>
+        </w:rPr>
+        <w:t>Figure 4.8: Stock — available / low / out board with Record sale</w:t>
       </w:r>
     </w:p>
     <w:p>
@@ -5199,7 +6898,7 @@
           <w:color w:val="000000"/>
           <w:sz w:val="24"/>
         </w:rPr>
-        <w:t>The SPA calls JSON APIs with Bearer JWT. SQLAlchemy maps models to PostgreSQL/SQLite. FX providers are chained with fallback. CSV import parses demo samples into products and shipments.</w:t>
+        <w:t>The React frontend calls JSON APIs with Bearer JWT. SQLAlchemy maps models to PostgreSQL/SQLite. FX providers are chained with fallback. CSV import parses demo samples into products and shipments.</w:t>
       </w:r>
     </w:p>
     <w:p>
@@ -5707,7 +7406,7 @@
                 <w:color w:val="000000"/>
                 <w:sz w:val="22"/>
               </w:rPr>
-              <w:t>Auto FX Demo B (UI starts 20; oracle @27.50)</w:t>
+              <w:t>Auto FX Demo B (rate 20)</w:t>
             </w:r>
           </w:p>
         </w:tc>
@@ -6138,7 +7837,7 @@
           <w:color w:val="000000"/>
           <w:sz w:val="24"/>
         </w:rPr>
-        <w:t>Demo A (SHP-DEMO-LOCAL-ZMW) locks grocery landed costs such as 170 / 107 / 160 / 120 / 93 with 30% suggested retail. Demo B (SHP-DEMO-AUTO-FX) opens with rate starter **20** (or last cache); oracle numbers use **27.50** and lock weight-based landed costs including earbud retail 226.56. CI fixtures in backend/tests/test_costing.py encode these oracles.</w:t>
+        <w:t>Demo A (SHP-DEMO-LOCAL-ZMW) locks grocery landed costs such as 170 / 107 / 160 / 120 / 93 with 30% suggested retail. Demo B (SHP-DEMO-AUTO-FX) uses FX rate **20** (UI starter = oracle) and locks weight-based landed costs 136.25 / 145 / 46.25 / 92.50 (earbud suggested retail 170.31). CI fixtures in backend/tests/test_costing.py encode these oracles.</w:t>
       </w:r>
     </w:p>
     <w:p>
@@ -7474,7 +9173,7 @@
                 <w:color w:val="000000"/>
                 <w:sz w:val="22"/>
               </w:rPr>
-              <w:t>[SUPERVISOR NAME]</w:t>
+              <w:t>Mrs. Leena Kumar</w:t>
             </w:r>
           </w:p>
         </w:tc>
@@ -7843,11 +9542,12 @@
       </w:r>
     </w:p>
     <w:sectPr>
-      <w:footerReference w:type="default" r:id="rId9"/>
+      <w:footerReference w:type="default" r:id="rId12"/>
       <w:pgSz w:w="11906" w:h="16838"/>
       <w:pgMar w:top="1440" w:right="1440" w:bottom="1440" w:left="1440" w:header="720" w:footer="720" w:gutter="0"/>
       <w:cols w:space="720"/>
       <w:docGrid w:linePitch="360"/>
+      <w:pgNumType w:fmt="decimal" w:start="1"/>
     </w:sectPr>
   </w:body>
 </w:document>
@@ -7857,7 +9557,6 @@
 <w:ftr xmlns:m="http://schemas.openxmlformats.org/officeDocument/2006/math" xmlns:mc="http://schemas.openxmlformats.org/markup-compatibility/2006" xmlns:mo="http://schemas.microsoft.com/office/mac/office/2008/main" xmlns:mv="urn:schemas-microsoft-com:mac:vml" xmlns:o="urn:schemas-microsoft-com:office:office" xmlns:r="http://schemas.openxmlformats.org/officeDocument/2006/relationships" xmlns:v="urn:schemas-microsoft-com:vml" xmlns:w10="urn:schemas-microsoft-com:office:word" xmlns:w14="http://schemas.microsoft.com/office/word/2010/wordml" xmlns:w="http://schemas.openxmlformats.org/wordprocessingml/2006/main" xmlns:wne="http://schemas.microsoft.com/office/word/2006/wordml" xmlns:wp14="http://schemas.microsoft.com/office/word/2010/wordprocessingDrawing" xmlns:wp="http://schemas.openxmlformats.org/drawingml/2006/wordprocessingDrawing" xmlns:wpc="http://schemas.microsoft.com/office/word/2010/wordprocessingCanvas" xmlns:wpg="http://schemas.microsoft.com/office/word/2010/wordprocessingGroup" xmlns:wpi="http://schemas.microsoft.com/office/word/2010/wordprocessingInk" xmlns:wps="http://schemas.microsoft.com/office/word/2010/wordprocessingShape" mc:Ignorable="w14 wp14">
   <w:p>
     <w:pPr>
-      <w:pStyle w:val="Footer"/>
       <w:ind w:firstLine="0"/>
       <w:jc w:val="center"/>
     </w:pPr>
@@ -7869,8 +9568,21 @@
         <w:color w:val="000000"/>
         <w:sz w:val="20"/>
       </w:rPr>
-      <w:t xml:space="preserve">Page </w:t>
+      <w:fldChar w:fldCharType="begin"/>
+      <w:instrText xml:space="preserve"> PAGE </w:instrText>
+      <w:fldChar w:fldCharType="end"/>
     </w:r>
+  </w:p>
+</w:ftr>
+</file>
+
+<file path=word/footer2.xml><?xml version="1.0" encoding="utf-8"?>
+<w:ftr xmlns:m="http://schemas.openxmlformats.org/officeDocument/2006/math" xmlns:mc="http://schemas.openxmlformats.org/markup-compatibility/2006" xmlns:mo="http://schemas.microsoft.com/office/mac/office/2008/main" xmlns:mv="urn:schemas-microsoft-com:mac:vml" xmlns:o="urn:schemas-microsoft-com:office:office" xmlns:r="http://schemas.openxmlformats.org/officeDocument/2006/relationships" xmlns:v="urn:schemas-microsoft-com:vml" xmlns:w10="urn:schemas-microsoft-com:office:word" xmlns:w14="http://schemas.microsoft.com/office/word/2010/wordml" xmlns:w="http://schemas.openxmlformats.org/wordprocessingml/2006/main" xmlns:wne="http://schemas.microsoft.com/office/word/2006/wordml" xmlns:wp14="http://schemas.microsoft.com/office/word/2010/wordprocessingDrawing" xmlns:wp="http://schemas.openxmlformats.org/drawingml/2006/wordprocessingDrawing" xmlns:wpc="http://schemas.microsoft.com/office/word/2010/wordprocessingCanvas" xmlns:wpg="http://schemas.microsoft.com/office/word/2010/wordprocessingGroup" xmlns:wpi="http://schemas.microsoft.com/office/word/2010/wordprocessingInk" xmlns:wps="http://schemas.microsoft.com/office/word/2010/wordprocessingShape" mc:Ignorable="w14 wp14">
+  <w:p>
+    <w:pPr>
+      <w:ind w:firstLine="0"/>
+      <w:jc w:val="center"/>
+    </w:pPr>
     <w:r>
       <w:rPr>
         <w:rFonts w:ascii="Times New Roman" w:hAnsi="Times New Roman" w:eastAsia="Times New Roman"/>

</xml_diff>